<commit_message>
Actualizar evidencia E2E (22/10/2026 09:49:39, 66,2 s) y regenerar documento final
</commit_message>
<xml_diff>
--- a/docs/Sistema_Trabajos_de_Grado_UTS.docx
+++ b/docs/Sistema_Trabajos_de_Grado_UTS.docx
@@ -495,7 +495,7 @@
       <w:pPr>
         <w:pStyle w:val="Ttulo1"/>
       </w:pPr>
-      <w:bookmarkStart w:id="0" w:name="_Toc243554846"/>
+      <w:bookmarkStart w:id="0" w:name="_Toc243555439"/>
       <w:r>
         <w:rPr>
           <w:rFonts w:ascii="Calibri" w:hAnsi="Calibri"/>
@@ -534,7 +534,7 @@
       <w:r>
         <w:fldChar w:fldCharType="separate"/>
       </w:r>
-      <w:hyperlink w:anchor="_Toc243554846" w:history="1">
+      <w:hyperlink w:anchor="_Toc243555439" w:history="1">
         <w:r>
           <w:rPr>
             <w:rStyle w:val="Hipervnculo"/>
@@ -561,7 +561,7 @@
             <w:noProof/>
             <w:webHidden/>
           </w:rPr>
-          <w:instrText xml:space="preserve"> PAGEREF _Toc243554846 \h </w:instrText>
+          <w:instrText xml:space="preserve"> PAGEREF _Toc243555439 \h </w:instrText>
         </w:r>
         <w:r>
           <w:rPr>
@@ -602,7 +602,7 @@
           <w:noProof/>
         </w:rPr>
       </w:pPr>
-      <w:hyperlink w:anchor="_Toc243554847" w:history="1">
+      <w:hyperlink w:anchor="_Toc243555440" w:history="1">
         <w:r>
           <w:rPr>
             <w:rStyle w:val="Hipervnculo"/>
@@ -629,7 +629,7 @@
             <w:noProof/>
             <w:webHidden/>
           </w:rPr>
-          <w:instrText xml:space="preserve"> PAGEREF _Toc243554847 \h </w:instrText>
+          <w:instrText xml:space="preserve"> PAGEREF _Toc243555440 \h </w:instrText>
         </w:r>
         <w:r>
           <w:rPr>
@@ -670,7 +670,7 @@
           <w:noProof/>
         </w:rPr>
       </w:pPr>
-      <w:hyperlink w:anchor="_Toc243554848" w:history="1">
+      <w:hyperlink w:anchor="_Toc243555441" w:history="1">
         <w:r>
           <w:rPr>
             <w:rStyle w:val="Hipervnculo"/>
@@ -697,7 +697,7 @@
             <w:noProof/>
             <w:webHidden/>
           </w:rPr>
-          <w:instrText xml:space="preserve"> PAGEREF _Toc243554848 \h </w:instrText>
+          <w:instrText xml:space="preserve"> PAGEREF _Toc243555441 \h </w:instrText>
         </w:r>
         <w:r>
           <w:rPr>
@@ -738,7 +738,7 @@
           <w:noProof/>
         </w:rPr>
       </w:pPr>
-      <w:hyperlink w:anchor="_Toc243554849" w:history="1">
+      <w:hyperlink w:anchor="_Toc243555442" w:history="1">
         <w:r>
           <w:rPr>
             <w:rStyle w:val="Hipervnculo"/>
@@ -765,7 +765,7 @@
             <w:noProof/>
             <w:webHidden/>
           </w:rPr>
-          <w:instrText xml:space="preserve"> PAGEREF _Toc243554849 \h </w:instrText>
+          <w:instrText xml:space="preserve"> PAGEREF _Toc243555442 \h </w:instrText>
         </w:r>
         <w:r>
           <w:rPr>
@@ -806,7 +806,7 @@
           <w:noProof/>
         </w:rPr>
       </w:pPr>
-      <w:hyperlink w:anchor="_Toc243554850" w:history="1">
+      <w:hyperlink w:anchor="_Toc243555443" w:history="1">
         <w:r>
           <w:rPr>
             <w:rStyle w:val="Hipervnculo"/>
@@ -833,7 +833,7 @@
             <w:noProof/>
             <w:webHidden/>
           </w:rPr>
-          <w:instrText xml:space="preserve"> PAGEREF _Toc243554850 \h </w:instrText>
+          <w:instrText xml:space="preserve"> PAGEREF _Toc243555443 \h </w:instrText>
         </w:r>
         <w:r>
           <w:rPr>
@@ -874,7 +874,7 @@
           <w:noProof/>
         </w:rPr>
       </w:pPr>
-      <w:hyperlink w:anchor="_Toc243554851" w:history="1">
+      <w:hyperlink w:anchor="_Toc243555444" w:history="1">
         <w:r>
           <w:rPr>
             <w:rStyle w:val="Hipervnculo"/>
@@ -901,7 +901,7 @@
             <w:noProof/>
             <w:webHidden/>
           </w:rPr>
-          <w:instrText xml:space="preserve"> PAGEREF _Toc243554851 \h </w:instrText>
+          <w:instrText xml:space="preserve"> PAGEREF _Toc243555444 \h </w:instrText>
         </w:r>
         <w:r>
           <w:rPr>
@@ -942,7 +942,7 @@
           <w:noProof/>
         </w:rPr>
       </w:pPr>
-      <w:hyperlink w:anchor="_Toc243554852" w:history="1">
+      <w:hyperlink w:anchor="_Toc243555445" w:history="1">
         <w:r>
           <w:rPr>
             <w:rStyle w:val="Hipervnculo"/>
@@ -969,7 +969,7 @@
             <w:noProof/>
             <w:webHidden/>
           </w:rPr>
-          <w:instrText xml:space="preserve"> PAGEREF _Toc243554852 \h </w:instrText>
+          <w:instrText xml:space="preserve"> PAGEREF _Toc243555445 \h </w:instrText>
         </w:r>
         <w:r>
           <w:rPr>
@@ -1010,7 +1010,7 @@
           <w:noProof/>
         </w:rPr>
       </w:pPr>
-      <w:hyperlink w:anchor="_Toc243554853" w:history="1">
+      <w:hyperlink w:anchor="_Toc243555446" w:history="1">
         <w:r>
           <w:rPr>
             <w:rStyle w:val="Hipervnculo"/>
@@ -1037,7 +1037,7 @@
             <w:noProof/>
             <w:webHidden/>
           </w:rPr>
-          <w:instrText xml:space="preserve"> PAGEREF _Toc243554853 \h </w:instrText>
+          <w:instrText xml:space="preserve"> PAGEREF _Toc243555446 \h </w:instrText>
         </w:r>
         <w:r>
           <w:rPr>
@@ -1078,7 +1078,7 @@
           <w:noProof/>
         </w:rPr>
       </w:pPr>
-      <w:hyperlink w:anchor="_Toc243554854" w:history="1">
+      <w:hyperlink w:anchor="_Toc243555447" w:history="1">
         <w:r>
           <w:rPr>
             <w:rStyle w:val="Hipervnculo"/>
@@ -1105,7 +1105,7 @@
             <w:noProof/>
             <w:webHidden/>
           </w:rPr>
-          <w:instrText xml:space="preserve"> PAGEREF _Toc243554854 \h </w:instrText>
+          <w:instrText xml:space="preserve"> PAGEREF _Toc243555447 \h </w:instrText>
         </w:r>
         <w:r>
           <w:rPr>
@@ -1146,7 +1146,7 @@
           <w:noProof/>
         </w:rPr>
       </w:pPr>
-      <w:hyperlink w:anchor="_Toc243554855" w:history="1">
+      <w:hyperlink w:anchor="_Toc243555448" w:history="1">
         <w:r>
           <w:rPr>
             <w:rStyle w:val="Hipervnculo"/>
@@ -1173,7 +1173,7 @@
             <w:noProof/>
             <w:webHidden/>
           </w:rPr>
-          <w:instrText xml:space="preserve"> PAGEREF _Toc243554855 \h </w:instrText>
+          <w:instrText xml:space="preserve"> PAGEREF _Toc243555448 \h </w:instrText>
         </w:r>
         <w:r>
           <w:rPr>
@@ -1214,7 +1214,7 @@
           <w:noProof/>
         </w:rPr>
       </w:pPr>
-      <w:hyperlink w:anchor="_Toc243554856" w:history="1">
+      <w:hyperlink w:anchor="_Toc243555449" w:history="1">
         <w:r>
           <w:rPr>
             <w:rStyle w:val="Hipervnculo"/>
@@ -1241,7 +1241,7 @@
             <w:noProof/>
             <w:webHidden/>
           </w:rPr>
-          <w:instrText xml:space="preserve"> PAGEREF _Toc243554856 \h </w:instrText>
+          <w:instrText xml:space="preserve"> PAGEREF _Toc243555449 \h </w:instrText>
         </w:r>
         <w:r>
           <w:rPr>
@@ -1282,7 +1282,7 @@
           <w:noProof/>
         </w:rPr>
       </w:pPr>
-      <w:hyperlink w:anchor="_Toc243554857" w:history="1">
+      <w:hyperlink w:anchor="_Toc243555450" w:history="1">
         <w:r>
           <w:rPr>
             <w:rStyle w:val="Hipervnculo"/>
@@ -1309,7 +1309,7 @@
             <w:noProof/>
             <w:webHidden/>
           </w:rPr>
-          <w:instrText xml:space="preserve"> PAGEREF _Toc243554857 \h </w:instrText>
+          <w:instrText xml:space="preserve"> PAGEREF _Toc243555450 \h </w:instrText>
         </w:r>
         <w:r>
           <w:rPr>
@@ -1350,7 +1350,7 @@
           <w:noProof/>
         </w:rPr>
       </w:pPr>
-      <w:hyperlink w:anchor="_Toc243554858" w:history="1">
+      <w:hyperlink w:anchor="_Toc243555451" w:history="1">
         <w:r>
           <w:rPr>
             <w:rStyle w:val="Hipervnculo"/>
@@ -1377,7 +1377,7 @@
             <w:noProof/>
             <w:webHidden/>
           </w:rPr>
-          <w:instrText xml:space="preserve"> PAGEREF _Toc243554858 \h </w:instrText>
+          <w:instrText xml:space="preserve"> PAGEREF _Toc243555451 \h </w:instrText>
         </w:r>
         <w:r>
           <w:rPr>
@@ -1418,7 +1418,7 @@
           <w:noProof/>
         </w:rPr>
       </w:pPr>
-      <w:hyperlink w:anchor="_Toc243554859" w:history="1">
+      <w:hyperlink w:anchor="_Toc243555452" w:history="1">
         <w:r>
           <w:rPr>
             <w:rStyle w:val="Hipervnculo"/>
@@ -1445,7 +1445,7 @@
             <w:noProof/>
             <w:webHidden/>
           </w:rPr>
-          <w:instrText xml:space="preserve"> PAGEREF _Toc243554859 \h </w:instrText>
+          <w:instrText xml:space="preserve"> PAGEREF _Toc243555452 \h </w:instrText>
         </w:r>
         <w:r>
           <w:rPr>
@@ -1486,7 +1486,7 @@
           <w:noProof/>
         </w:rPr>
       </w:pPr>
-      <w:hyperlink w:anchor="_Toc243554860" w:history="1">
+      <w:hyperlink w:anchor="_Toc243555453" w:history="1">
         <w:r>
           <w:rPr>
             <w:rStyle w:val="Hipervnculo"/>
@@ -1513,7 +1513,7 @@
             <w:noProof/>
             <w:webHidden/>
           </w:rPr>
-          <w:instrText xml:space="preserve"> PAGEREF _Toc243554860 \h </w:instrText>
+          <w:instrText xml:space="preserve"> PAGEREF _Toc243555453 \h </w:instrText>
         </w:r>
         <w:r>
           <w:rPr>
@@ -1554,7 +1554,7 @@
           <w:noProof/>
         </w:rPr>
       </w:pPr>
-      <w:hyperlink w:anchor="_Toc243554861" w:history="1">
+      <w:hyperlink w:anchor="_Toc243555454" w:history="1">
         <w:r>
           <w:rPr>
             <w:rStyle w:val="Hipervnculo"/>
@@ -1581,7 +1581,7 @@
             <w:noProof/>
             <w:webHidden/>
           </w:rPr>
-          <w:instrText xml:space="preserve"> PAGEREF _Toc243554861 \h </w:instrText>
+          <w:instrText xml:space="preserve"> PAGEREF _Toc243555454 \h </w:instrText>
         </w:r>
         <w:r>
           <w:rPr>
@@ -1622,7 +1622,7 @@
           <w:noProof/>
         </w:rPr>
       </w:pPr>
-      <w:hyperlink w:anchor="_Toc243554862" w:history="1">
+      <w:hyperlink w:anchor="_Toc243555455" w:history="1">
         <w:r>
           <w:rPr>
             <w:rStyle w:val="Hipervnculo"/>
@@ -1649,7 +1649,7 @@
             <w:noProof/>
             <w:webHidden/>
           </w:rPr>
-          <w:instrText xml:space="preserve"> PAGEREF _Toc243554862 \h </w:instrText>
+          <w:instrText xml:space="preserve"> PAGEREF _Toc243555455 \h </w:instrText>
         </w:r>
         <w:r>
           <w:rPr>
@@ -1690,7 +1690,7 @@
           <w:noProof/>
         </w:rPr>
       </w:pPr>
-      <w:hyperlink w:anchor="_Toc243554863" w:history="1">
+      <w:hyperlink w:anchor="_Toc243555456" w:history="1">
         <w:r>
           <w:rPr>
             <w:rStyle w:val="Hipervnculo"/>
@@ -1717,7 +1717,7 @@
             <w:noProof/>
             <w:webHidden/>
           </w:rPr>
-          <w:instrText xml:space="preserve"> PAGEREF _Toc243554863 \h </w:instrText>
+          <w:instrText xml:space="preserve"> PAGEREF _Toc243555456 \h </w:instrText>
         </w:r>
         <w:r>
           <w:rPr>
@@ -1758,7 +1758,7 @@
           <w:noProof/>
         </w:rPr>
       </w:pPr>
-      <w:hyperlink w:anchor="_Toc243554864" w:history="1">
+      <w:hyperlink w:anchor="_Toc243555457" w:history="1">
         <w:r>
           <w:rPr>
             <w:rStyle w:val="Hipervnculo"/>
@@ -1785,7 +1785,7 @@
             <w:noProof/>
             <w:webHidden/>
           </w:rPr>
-          <w:instrText xml:space="preserve"> PAGEREF _Toc243554864 \h </w:instrText>
+          <w:instrText xml:space="preserve"> PAGEREF _Toc243555457 \h </w:instrText>
         </w:r>
         <w:r>
           <w:rPr>
@@ -1826,7 +1826,7 @@
           <w:noProof/>
         </w:rPr>
       </w:pPr>
-      <w:hyperlink w:anchor="_Toc243554865" w:history="1">
+      <w:hyperlink w:anchor="_Toc243555458" w:history="1">
         <w:r>
           <w:rPr>
             <w:rStyle w:val="Hipervnculo"/>
@@ -1853,7 +1853,7 @@
             <w:noProof/>
             <w:webHidden/>
           </w:rPr>
-          <w:instrText xml:space="preserve"> PAGEREF _Toc243554865 \h </w:instrText>
+          <w:instrText xml:space="preserve"> PAGEREF _Toc243555458 \h </w:instrText>
         </w:r>
         <w:r>
           <w:rPr>
@@ -1894,7 +1894,7 @@
           <w:noProof/>
         </w:rPr>
       </w:pPr>
-      <w:hyperlink w:anchor="_Toc243554866" w:history="1">
+      <w:hyperlink w:anchor="_Toc243555459" w:history="1">
         <w:r>
           <w:rPr>
             <w:rStyle w:val="Hipervnculo"/>
@@ -1921,7 +1921,7 @@
             <w:noProof/>
             <w:webHidden/>
           </w:rPr>
-          <w:instrText xml:space="preserve"> PAGEREF _Toc243554866 \h </w:instrText>
+          <w:instrText xml:space="preserve"> PAGEREF _Toc243555459 \h </w:instrText>
         </w:r>
         <w:r>
           <w:rPr>
@@ -1962,7 +1962,7 @@
           <w:noProof/>
         </w:rPr>
       </w:pPr>
-      <w:hyperlink w:anchor="_Toc243554867" w:history="1">
+      <w:hyperlink w:anchor="_Toc243555460" w:history="1">
         <w:r>
           <w:rPr>
             <w:rStyle w:val="Hipervnculo"/>
@@ -1989,7 +1989,7 @@
             <w:noProof/>
             <w:webHidden/>
           </w:rPr>
-          <w:instrText xml:space="preserve"> PAGEREF _Toc243554867 \h </w:instrText>
+          <w:instrText xml:space="preserve"> PAGEREF _Toc243555460 \h </w:instrText>
         </w:r>
         <w:r>
           <w:rPr>
@@ -2030,7 +2030,7 @@
           <w:noProof/>
         </w:rPr>
       </w:pPr>
-      <w:hyperlink w:anchor="_Toc243554868" w:history="1">
+      <w:hyperlink w:anchor="_Toc243555461" w:history="1">
         <w:r>
           <w:rPr>
             <w:rStyle w:val="Hipervnculo"/>
@@ -2057,7 +2057,7 @@
             <w:noProof/>
             <w:webHidden/>
           </w:rPr>
-          <w:instrText xml:space="preserve"> PAGEREF _Toc243554868 \h </w:instrText>
+          <w:instrText xml:space="preserve"> PAGEREF _Toc243555461 \h </w:instrText>
         </w:r>
         <w:r>
           <w:rPr>
@@ -2098,7 +2098,7 @@
           <w:noProof/>
         </w:rPr>
       </w:pPr>
-      <w:hyperlink w:anchor="_Toc243554869" w:history="1">
+      <w:hyperlink w:anchor="_Toc243555462" w:history="1">
         <w:r>
           <w:rPr>
             <w:rStyle w:val="Hipervnculo"/>
@@ -2125,7 +2125,7 @@
             <w:noProof/>
             <w:webHidden/>
           </w:rPr>
-          <w:instrText xml:space="preserve"> PAGEREF _Toc243554869 \h </w:instrText>
+          <w:instrText xml:space="preserve"> PAGEREF _Toc243555462 \h </w:instrText>
         </w:r>
         <w:r>
           <w:rPr>
@@ -2166,7 +2166,7 @@
           <w:noProof/>
         </w:rPr>
       </w:pPr>
-      <w:hyperlink w:anchor="_Toc243554870" w:history="1">
+      <w:hyperlink w:anchor="_Toc243555463" w:history="1">
         <w:r>
           <w:rPr>
             <w:rStyle w:val="Hipervnculo"/>
@@ -2193,7 +2193,7 @@
             <w:noProof/>
             <w:webHidden/>
           </w:rPr>
-          <w:instrText xml:space="preserve"> PAGEREF _Toc243554870 \h </w:instrText>
+          <w:instrText xml:space="preserve"> PAGEREF _Toc243555463 \h </w:instrText>
         </w:r>
         <w:r>
           <w:rPr>
@@ -2234,7 +2234,7 @@
           <w:noProof/>
         </w:rPr>
       </w:pPr>
-      <w:hyperlink w:anchor="_Toc243554871" w:history="1">
+      <w:hyperlink w:anchor="_Toc243555464" w:history="1">
         <w:r>
           <w:rPr>
             <w:rStyle w:val="Hipervnculo"/>
@@ -2261,7 +2261,7 @@
             <w:noProof/>
             <w:webHidden/>
           </w:rPr>
-          <w:instrText xml:space="preserve"> PAGEREF _Toc243554871 \h </w:instrText>
+          <w:instrText xml:space="preserve"> PAGEREF _Toc243555464 \h </w:instrText>
         </w:r>
         <w:r>
           <w:rPr>
@@ -2302,7 +2302,7 @@
           <w:noProof/>
         </w:rPr>
       </w:pPr>
-      <w:hyperlink w:anchor="_Toc243554872" w:history="1">
+      <w:hyperlink w:anchor="_Toc243555465" w:history="1">
         <w:r>
           <w:rPr>
             <w:rStyle w:val="Hipervnculo"/>
@@ -2329,7 +2329,7 @@
             <w:noProof/>
             <w:webHidden/>
           </w:rPr>
-          <w:instrText xml:space="preserve"> PAGEREF _Toc243554872 \h </w:instrText>
+          <w:instrText xml:space="preserve"> PAGEREF _Toc243555465 \h </w:instrText>
         </w:r>
         <w:r>
           <w:rPr>
@@ -2370,7 +2370,7 @@
           <w:noProof/>
         </w:rPr>
       </w:pPr>
-      <w:hyperlink w:anchor="_Toc243554873" w:history="1">
+      <w:hyperlink w:anchor="_Toc243555466" w:history="1">
         <w:r>
           <w:rPr>
             <w:rStyle w:val="Hipervnculo"/>
@@ -2397,7 +2397,7 @@
             <w:noProof/>
             <w:webHidden/>
           </w:rPr>
-          <w:instrText xml:space="preserve"> PAGEREF _Toc243554873 \h </w:instrText>
+          <w:instrText xml:space="preserve"> PAGEREF _Toc243555466 \h </w:instrText>
         </w:r>
         <w:r>
           <w:rPr>
@@ -2438,7 +2438,7 @@
           <w:noProof/>
         </w:rPr>
       </w:pPr>
-      <w:hyperlink w:anchor="_Toc243554874" w:history="1">
+      <w:hyperlink w:anchor="_Toc243555467" w:history="1">
         <w:r>
           <w:rPr>
             <w:rStyle w:val="Hipervnculo"/>
@@ -2465,7 +2465,7 @@
             <w:noProof/>
             <w:webHidden/>
           </w:rPr>
-          <w:instrText xml:space="preserve"> PAGEREF _Toc243554874 \h </w:instrText>
+          <w:instrText xml:space="preserve"> PAGEREF _Toc243555467 \h </w:instrText>
         </w:r>
         <w:r>
           <w:rPr>
@@ -2506,7 +2506,7 @@
           <w:noProof/>
         </w:rPr>
       </w:pPr>
-      <w:hyperlink w:anchor="_Toc243554875" w:history="1">
+      <w:hyperlink w:anchor="_Toc243555468" w:history="1">
         <w:r>
           <w:rPr>
             <w:rStyle w:val="Hipervnculo"/>
@@ -2533,7 +2533,7 @@
             <w:noProof/>
             <w:webHidden/>
           </w:rPr>
-          <w:instrText xml:space="preserve"> PAGEREF _Toc243554875 \h </w:instrText>
+          <w:instrText xml:space="preserve"> PAGEREF _Toc243555468 \h </w:instrText>
         </w:r>
         <w:r>
           <w:rPr>
@@ -2574,7 +2574,7 @@
           <w:noProof/>
         </w:rPr>
       </w:pPr>
-      <w:hyperlink w:anchor="_Toc243554876" w:history="1">
+      <w:hyperlink w:anchor="_Toc243555469" w:history="1">
         <w:r>
           <w:rPr>
             <w:rStyle w:val="Hipervnculo"/>
@@ -2601,7 +2601,7 @@
             <w:noProof/>
             <w:webHidden/>
           </w:rPr>
-          <w:instrText xml:space="preserve"> PAGEREF _Toc243554876 \h </w:instrText>
+          <w:instrText xml:space="preserve"> PAGEREF _Toc243555469 \h </w:instrText>
         </w:r>
         <w:r>
           <w:rPr>
@@ -2642,7 +2642,7 @@
           <w:noProof/>
         </w:rPr>
       </w:pPr>
-      <w:hyperlink w:anchor="_Toc243554877" w:history="1">
+      <w:hyperlink w:anchor="_Toc243555470" w:history="1">
         <w:r>
           <w:rPr>
             <w:rStyle w:val="Hipervnculo"/>
@@ -2669,7 +2669,7 @@
             <w:noProof/>
             <w:webHidden/>
           </w:rPr>
-          <w:instrText xml:space="preserve"> PAGEREF _Toc243554877 \h </w:instrText>
+          <w:instrText xml:space="preserve"> PAGEREF _Toc243555470 \h </w:instrText>
         </w:r>
         <w:r>
           <w:rPr>
@@ -2710,7 +2710,7 @@
           <w:noProof/>
         </w:rPr>
       </w:pPr>
-      <w:hyperlink w:anchor="_Toc243554878" w:history="1">
+      <w:hyperlink w:anchor="_Toc243555471" w:history="1">
         <w:r>
           <w:rPr>
             <w:rStyle w:val="Hipervnculo"/>
@@ -2737,7 +2737,7 @@
             <w:noProof/>
             <w:webHidden/>
           </w:rPr>
-          <w:instrText xml:space="preserve"> PAGEREF _Toc243554878 \h </w:instrText>
+          <w:instrText xml:space="preserve"> PAGEREF _Toc243555471 \h </w:instrText>
         </w:r>
         <w:r>
           <w:rPr>
@@ -2778,7 +2778,7 @@
           <w:noProof/>
         </w:rPr>
       </w:pPr>
-      <w:hyperlink w:anchor="_Toc243554879" w:history="1">
+      <w:hyperlink w:anchor="_Toc243555472" w:history="1">
         <w:r>
           <w:rPr>
             <w:rStyle w:val="Hipervnculo"/>
@@ -2805,7 +2805,7 @@
             <w:noProof/>
             <w:webHidden/>
           </w:rPr>
-          <w:instrText xml:space="preserve"> PAGEREF _Toc243554879 \h </w:instrText>
+          <w:instrText xml:space="preserve"> PAGEREF _Toc243555472 \h </w:instrText>
         </w:r>
         <w:r>
           <w:rPr>
@@ -2846,7 +2846,7 @@
           <w:noProof/>
         </w:rPr>
       </w:pPr>
-      <w:hyperlink w:anchor="_Toc243554880" w:history="1">
+      <w:hyperlink w:anchor="_Toc243555473" w:history="1">
         <w:r>
           <w:rPr>
             <w:rStyle w:val="Hipervnculo"/>
@@ -2873,7 +2873,7 @@
             <w:noProof/>
             <w:webHidden/>
           </w:rPr>
-          <w:instrText xml:space="preserve"> PAGEREF _Toc243554880 \h </w:instrText>
+          <w:instrText xml:space="preserve"> PAGEREF _Toc243555473 \h </w:instrText>
         </w:r>
         <w:r>
           <w:rPr>
@@ -2914,7 +2914,7 @@
           <w:noProof/>
         </w:rPr>
       </w:pPr>
-      <w:hyperlink w:anchor="_Toc243554881" w:history="1">
+      <w:hyperlink w:anchor="_Toc243555474" w:history="1">
         <w:r>
           <w:rPr>
             <w:rStyle w:val="Hipervnculo"/>
@@ -2941,7 +2941,7 @@
             <w:noProof/>
             <w:webHidden/>
           </w:rPr>
-          <w:instrText xml:space="preserve"> PAGEREF _Toc243554881 \h </w:instrText>
+          <w:instrText xml:space="preserve"> PAGEREF _Toc243555474 \h </w:instrText>
         </w:r>
         <w:r>
           <w:rPr>
@@ -2982,7 +2982,7 @@
           <w:noProof/>
         </w:rPr>
       </w:pPr>
-      <w:hyperlink w:anchor="_Toc243554882" w:history="1">
+      <w:hyperlink w:anchor="_Toc243555475" w:history="1">
         <w:r>
           <w:rPr>
             <w:rStyle w:val="Hipervnculo"/>
@@ -3009,7 +3009,7 @@
             <w:noProof/>
             <w:webHidden/>
           </w:rPr>
-          <w:instrText xml:space="preserve"> PAGEREF _Toc243554882 \h </w:instrText>
+          <w:instrText xml:space="preserve"> PAGEREF _Toc243555475 \h </w:instrText>
         </w:r>
         <w:r>
           <w:rPr>
@@ -3050,7 +3050,7 @@
           <w:noProof/>
         </w:rPr>
       </w:pPr>
-      <w:hyperlink w:anchor="_Toc243554883" w:history="1">
+      <w:hyperlink w:anchor="_Toc243555476" w:history="1">
         <w:r>
           <w:rPr>
             <w:rStyle w:val="Hipervnculo"/>
@@ -3077,7 +3077,7 @@
             <w:noProof/>
             <w:webHidden/>
           </w:rPr>
-          <w:instrText xml:space="preserve"> PAGEREF _Toc243554883 \h </w:instrText>
+          <w:instrText xml:space="preserve"> PAGEREF _Toc243555476 \h </w:instrText>
         </w:r>
         <w:r>
           <w:rPr>
@@ -3118,7 +3118,7 @@
           <w:noProof/>
         </w:rPr>
       </w:pPr>
-      <w:hyperlink w:anchor="_Toc243554884" w:history="1">
+      <w:hyperlink w:anchor="_Toc243555477" w:history="1">
         <w:r>
           <w:rPr>
             <w:rStyle w:val="Hipervnculo"/>
@@ -3145,7 +3145,7 @@
             <w:noProof/>
             <w:webHidden/>
           </w:rPr>
-          <w:instrText xml:space="preserve"> PAGEREF _Toc243554884 \h </w:instrText>
+          <w:instrText xml:space="preserve"> PAGEREF _Toc243555477 \h </w:instrText>
         </w:r>
         <w:r>
           <w:rPr>
@@ -3186,7 +3186,7 @@
           <w:noProof/>
         </w:rPr>
       </w:pPr>
-      <w:hyperlink w:anchor="_Toc243554885" w:history="1">
+      <w:hyperlink w:anchor="_Toc243555478" w:history="1">
         <w:r>
           <w:rPr>
             <w:rStyle w:val="Hipervnculo"/>
@@ -3213,7 +3213,7 @@
             <w:noProof/>
             <w:webHidden/>
           </w:rPr>
-          <w:instrText xml:space="preserve"> PAGEREF _Toc243554885 \h </w:instrText>
+          <w:instrText xml:space="preserve"> PAGEREF _Toc243555478 \h </w:instrText>
         </w:r>
         <w:r>
           <w:rPr>
@@ -3254,7 +3254,7 @@
           <w:noProof/>
         </w:rPr>
       </w:pPr>
-      <w:hyperlink w:anchor="_Toc243554886" w:history="1">
+      <w:hyperlink w:anchor="_Toc243555479" w:history="1">
         <w:r>
           <w:rPr>
             <w:rStyle w:val="Hipervnculo"/>
@@ -3281,7 +3281,7 @@
             <w:noProof/>
             <w:webHidden/>
           </w:rPr>
-          <w:instrText xml:space="preserve"> PAGEREF _Toc243554886 \h </w:instrText>
+          <w:instrText xml:space="preserve"> PAGEREF _Toc243555479 \h </w:instrText>
         </w:r>
         <w:r>
           <w:rPr>
@@ -3322,7 +3322,7 @@
           <w:noProof/>
         </w:rPr>
       </w:pPr>
-      <w:hyperlink w:anchor="_Toc243554887" w:history="1">
+      <w:hyperlink w:anchor="_Toc243555480" w:history="1">
         <w:r>
           <w:rPr>
             <w:rStyle w:val="Hipervnculo"/>
@@ -3349,7 +3349,7 @@
             <w:noProof/>
             <w:webHidden/>
           </w:rPr>
-          <w:instrText xml:space="preserve"> PAGEREF _Toc243554887 \h </w:instrText>
+          <w:instrText xml:space="preserve"> PAGEREF _Toc243555480 \h </w:instrText>
         </w:r>
         <w:r>
           <w:rPr>
@@ -3390,7 +3390,7 @@
           <w:noProof/>
         </w:rPr>
       </w:pPr>
-      <w:hyperlink w:anchor="_Toc243554888" w:history="1">
+      <w:hyperlink w:anchor="_Toc243555481" w:history="1">
         <w:r>
           <w:rPr>
             <w:rStyle w:val="Hipervnculo"/>
@@ -3417,7 +3417,7 @@
             <w:noProof/>
             <w:webHidden/>
           </w:rPr>
-          <w:instrText xml:space="preserve"> PAGEREF _Toc243554888 \h </w:instrText>
+          <w:instrText xml:space="preserve"> PAGEREF _Toc243555481 \h </w:instrText>
         </w:r>
         <w:r>
           <w:rPr>
@@ -3458,7 +3458,7 @@
           <w:noProof/>
         </w:rPr>
       </w:pPr>
-      <w:hyperlink w:anchor="_Toc243554889" w:history="1">
+      <w:hyperlink w:anchor="_Toc243555482" w:history="1">
         <w:r>
           <w:rPr>
             <w:rStyle w:val="Hipervnculo"/>
@@ -3485,7 +3485,7 @@
             <w:noProof/>
             <w:webHidden/>
           </w:rPr>
-          <w:instrText xml:space="preserve"> PAGEREF _Toc243554889 \h </w:instrText>
+          <w:instrText xml:space="preserve"> PAGEREF _Toc243555482 \h </w:instrText>
         </w:r>
         <w:r>
           <w:rPr>
@@ -3526,7 +3526,7 @@
           <w:noProof/>
         </w:rPr>
       </w:pPr>
-      <w:hyperlink w:anchor="_Toc243554890" w:history="1">
+      <w:hyperlink w:anchor="_Toc243555483" w:history="1">
         <w:r>
           <w:rPr>
             <w:rStyle w:val="Hipervnculo"/>
@@ -3553,7 +3553,7 @@
             <w:noProof/>
             <w:webHidden/>
           </w:rPr>
-          <w:instrText xml:space="preserve"> PAGEREF _Toc243554890 \h </w:instrText>
+          <w:instrText xml:space="preserve"> PAGEREF _Toc243555483 \h </w:instrText>
         </w:r>
         <w:r>
           <w:rPr>
@@ -3594,7 +3594,7 @@
           <w:noProof/>
         </w:rPr>
       </w:pPr>
-      <w:hyperlink w:anchor="_Toc243554891" w:history="1">
+      <w:hyperlink w:anchor="_Toc243555484" w:history="1">
         <w:r>
           <w:rPr>
             <w:rStyle w:val="Hipervnculo"/>
@@ -3621,7 +3621,7 @@
             <w:noProof/>
             <w:webHidden/>
           </w:rPr>
-          <w:instrText xml:space="preserve"> PAGEREF _Toc243554891 \h </w:instrText>
+          <w:instrText xml:space="preserve"> PAGEREF _Toc243555484 \h </w:instrText>
         </w:r>
         <w:r>
           <w:rPr>
@@ -3662,7 +3662,7 @@
           <w:noProof/>
         </w:rPr>
       </w:pPr>
-      <w:hyperlink w:anchor="_Toc243554892" w:history="1">
+      <w:hyperlink w:anchor="_Toc243555485" w:history="1">
         <w:r>
           <w:rPr>
             <w:rStyle w:val="Hipervnculo"/>
@@ -3689,7 +3689,7 @@
             <w:noProof/>
             <w:webHidden/>
           </w:rPr>
-          <w:instrText xml:space="preserve"> PAGEREF _Toc243554892 \h </w:instrText>
+          <w:instrText xml:space="preserve"> PAGEREF _Toc243555485 \h </w:instrText>
         </w:r>
         <w:r>
           <w:rPr>
@@ -3730,7 +3730,7 @@
           <w:noProof/>
         </w:rPr>
       </w:pPr>
-      <w:hyperlink w:anchor="_Toc243554893" w:history="1">
+      <w:hyperlink w:anchor="_Toc243555486" w:history="1">
         <w:r>
           <w:rPr>
             <w:rStyle w:val="Hipervnculo"/>
@@ -3757,7 +3757,7 @@
             <w:noProof/>
             <w:webHidden/>
           </w:rPr>
-          <w:instrText xml:space="preserve"> PAGEREF _Toc243554893 \h </w:instrText>
+          <w:instrText xml:space="preserve"> PAGEREF _Toc243555486 \h </w:instrText>
         </w:r>
         <w:r>
           <w:rPr>
@@ -3798,7 +3798,7 @@
           <w:noProof/>
         </w:rPr>
       </w:pPr>
-      <w:hyperlink w:anchor="_Toc243554894" w:history="1">
+      <w:hyperlink w:anchor="_Toc243555487" w:history="1">
         <w:r>
           <w:rPr>
             <w:rStyle w:val="Hipervnculo"/>
@@ -3825,7 +3825,7 @@
             <w:noProof/>
             <w:webHidden/>
           </w:rPr>
-          <w:instrText xml:space="preserve"> PAGEREF _Toc243554894 \h </w:instrText>
+          <w:instrText xml:space="preserve"> PAGEREF _Toc243555487 \h </w:instrText>
         </w:r>
         <w:r>
           <w:rPr>
@@ -3866,7 +3866,7 @@
           <w:noProof/>
         </w:rPr>
       </w:pPr>
-      <w:hyperlink w:anchor="_Toc243554895" w:history="1">
+      <w:hyperlink w:anchor="_Toc243555488" w:history="1">
         <w:r>
           <w:rPr>
             <w:rStyle w:val="Hipervnculo"/>
@@ -3893,7 +3893,7 @@
             <w:noProof/>
             <w:webHidden/>
           </w:rPr>
-          <w:instrText xml:space="preserve"> PAGEREF _Toc243554895 \h </w:instrText>
+          <w:instrText xml:space="preserve"> PAGEREF _Toc243555488 \h </w:instrText>
         </w:r>
         <w:r>
           <w:rPr>
@@ -3934,7 +3934,7 @@
           <w:noProof/>
         </w:rPr>
       </w:pPr>
-      <w:hyperlink w:anchor="_Toc243554896" w:history="1">
+      <w:hyperlink w:anchor="_Toc243555489" w:history="1">
         <w:r>
           <w:rPr>
             <w:rStyle w:val="Hipervnculo"/>
@@ -3961,7 +3961,7 @@
             <w:noProof/>
             <w:webHidden/>
           </w:rPr>
-          <w:instrText xml:space="preserve"> PAGEREF _Toc243554896 \h </w:instrText>
+          <w:instrText xml:space="preserve"> PAGEREF _Toc243555489 \h </w:instrText>
         </w:r>
         <w:r>
           <w:rPr>
@@ -4002,7 +4002,7 @@
           <w:noProof/>
         </w:rPr>
       </w:pPr>
-      <w:hyperlink w:anchor="_Toc243554897" w:history="1">
+      <w:hyperlink w:anchor="_Toc243555490" w:history="1">
         <w:r>
           <w:rPr>
             <w:rStyle w:val="Hipervnculo"/>
@@ -4029,7 +4029,7 @@
             <w:noProof/>
             <w:webHidden/>
           </w:rPr>
-          <w:instrText xml:space="preserve"> PAGEREF _Toc243554897 \h </w:instrText>
+          <w:instrText xml:space="preserve"> PAGEREF _Toc243555490 \h </w:instrText>
         </w:r>
         <w:r>
           <w:rPr>
@@ -4070,7 +4070,7 @@
           <w:noProof/>
         </w:rPr>
       </w:pPr>
-      <w:hyperlink w:anchor="_Toc243554898" w:history="1">
+      <w:hyperlink w:anchor="_Toc243555491" w:history="1">
         <w:r>
           <w:rPr>
             <w:rStyle w:val="Hipervnculo"/>
@@ -4097,7 +4097,7 @@
             <w:noProof/>
             <w:webHidden/>
           </w:rPr>
-          <w:instrText xml:space="preserve"> PAGEREF _Toc243554898 \h </w:instrText>
+          <w:instrText xml:space="preserve"> PAGEREF _Toc243555491 \h </w:instrText>
         </w:r>
         <w:r>
           <w:rPr>
@@ -4138,7 +4138,7 @@
           <w:noProof/>
         </w:rPr>
       </w:pPr>
-      <w:hyperlink w:anchor="_Toc243554899" w:history="1">
+      <w:hyperlink w:anchor="_Toc243555492" w:history="1">
         <w:r>
           <w:rPr>
             <w:rStyle w:val="Hipervnculo"/>
@@ -4165,7 +4165,7 @@
             <w:noProof/>
             <w:webHidden/>
           </w:rPr>
-          <w:instrText xml:space="preserve"> PAGEREF _Toc243554899 \h </w:instrText>
+          <w:instrText xml:space="preserve"> PAGEREF _Toc243555492 \h </w:instrText>
         </w:r>
         <w:r>
           <w:rPr>
@@ -4206,7 +4206,7 @@
           <w:noProof/>
         </w:rPr>
       </w:pPr>
-      <w:hyperlink w:anchor="_Toc243554900" w:history="1">
+      <w:hyperlink w:anchor="_Toc243555493" w:history="1">
         <w:r>
           <w:rPr>
             <w:rStyle w:val="Hipervnculo"/>
@@ -4233,7 +4233,7 @@
             <w:noProof/>
             <w:webHidden/>
           </w:rPr>
-          <w:instrText xml:space="preserve"> PAGEREF _Toc243554900 \h </w:instrText>
+          <w:instrText xml:space="preserve"> PAGEREF _Toc243555493 \h </w:instrText>
         </w:r>
         <w:r>
           <w:rPr>
@@ -4274,7 +4274,7 @@
           <w:noProof/>
         </w:rPr>
       </w:pPr>
-      <w:hyperlink w:anchor="_Toc243554901" w:history="1">
+      <w:hyperlink w:anchor="_Toc243555494" w:history="1">
         <w:r>
           <w:rPr>
             <w:rStyle w:val="Hipervnculo"/>
@@ -4301,7 +4301,7 @@
             <w:noProof/>
             <w:webHidden/>
           </w:rPr>
-          <w:instrText xml:space="preserve"> PAGEREF _Toc243554901 \h </w:instrText>
+          <w:instrText xml:space="preserve"> PAGEREF _Toc243555494 \h </w:instrText>
         </w:r>
         <w:r>
           <w:rPr>
@@ -4342,7 +4342,7 @@
           <w:noProof/>
         </w:rPr>
       </w:pPr>
-      <w:hyperlink w:anchor="_Toc243554902" w:history="1">
+      <w:hyperlink w:anchor="_Toc243555495" w:history="1">
         <w:r>
           <w:rPr>
             <w:rStyle w:val="Hipervnculo"/>
@@ -4369,7 +4369,7 @@
             <w:noProof/>
             <w:webHidden/>
           </w:rPr>
-          <w:instrText xml:space="preserve"> PAGEREF _Toc243554902 \h </w:instrText>
+          <w:instrText xml:space="preserve"> PAGEREF _Toc243555495 \h </w:instrText>
         </w:r>
         <w:r>
           <w:rPr>
@@ -4410,7 +4410,7 @@
           <w:noProof/>
         </w:rPr>
       </w:pPr>
-      <w:hyperlink w:anchor="_Toc243554903" w:history="1">
+      <w:hyperlink w:anchor="_Toc243555496" w:history="1">
         <w:r>
           <w:rPr>
             <w:rStyle w:val="Hipervnculo"/>
@@ -4437,7 +4437,7 @@
             <w:noProof/>
             <w:webHidden/>
           </w:rPr>
-          <w:instrText xml:space="preserve"> PAGEREF _Toc243554903 \h </w:instrText>
+          <w:instrText xml:space="preserve"> PAGEREF _Toc243555496 \h </w:instrText>
         </w:r>
         <w:r>
           <w:rPr>
@@ -4478,7 +4478,7 @@
           <w:noProof/>
         </w:rPr>
       </w:pPr>
-      <w:hyperlink w:anchor="_Toc243554904" w:history="1">
+      <w:hyperlink w:anchor="_Toc243555497" w:history="1">
         <w:r>
           <w:rPr>
             <w:rStyle w:val="Hipervnculo"/>
@@ -4505,7 +4505,7 @@
             <w:noProof/>
             <w:webHidden/>
           </w:rPr>
-          <w:instrText xml:space="preserve"> PAGEREF _Toc243554904 \h </w:instrText>
+          <w:instrText xml:space="preserve"> PAGEREF _Toc243555497 \h </w:instrText>
         </w:r>
         <w:r>
           <w:rPr>
@@ -4546,7 +4546,7 @@
           <w:noProof/>
         </w:rPr>
       </w:pPr>
-      <w:hyperlink w:anchor="_Toc243554905" w:history="1">
+      <w:hyperlink w:anchor="_Toc243555498" w:history="1">
         <w:r>
           <w:rPr>
             <w:rStyle w:val="Hipervnculo"/>
@@ -4573,7 +4573,7 @@
             <w:noProof/>
             <w:webHidden/>
           </w:rPr>
-          <w:instrText xml:space="preserve"> PAGEREF _Toc243554905 \h </w:instrText>
+          <w:instrText xml:space="preserve"> PAGEREF _Toc243555498 \h </w:instrText>
         </w:r>
         <w:r>
           <w:rPr>
@@ -4614,7 +4614,7 @@
           <w:noProof/>
         </w:rPr>
       </w:pPr>
-      <w:hyperlink w:anchor="_Toc243554906" w:history="1">
+      <w:hyperlink w:anchor="_Toc243555499" w:history="1">
         <w:r>
           <w:rPr>
             <w:rStyle w:val="Hipervnculo"/>
@@ -4641,7 +4641,7 @@
             <w:noProof/>
             <w:webHidden/>
           </w:rPr>
-          <w:instrText xml:space="preserve"> PAGEREF _Toc243554906 \h </w:instrText>
+          <w:instrText xml:space="preserve"> PAGEREF _Toc243555499 \h </w:instrText>
         </w:r>
         <w:r>
           <w:rPr>
@@ -4682,7 +4682,7 @@
           <w:noProof/>
         </w:rPr>
       </w:pPr>
-      <w:hyperlink w:anchor="_Toc243554907" w:history="1">
+      <w:hyperlink w:anchor="_Toc243555500" w:history="1">
         <w:r>
           <w:rPr>
             <w:rStyle w:val="Hipervnculo"/>
@@ -4709,7 +4709,7 @@
             <w:noProof/>
             <w:webHidden/>
           </w:rPr>
-          <w:instrText xml:space="preserve"> PAGEREF _Toc243554907 \h </w:instrText>
+          <w:instrText xml:space="preserve"> PAGEREF _Toc243555500 \h </w:instrText>
         </w:r>
         <w:r>
           <w:rPr>
@@ -4750,7 +4750,7 @@
           <w:noProof/>
         </w:rPr>
       </w:pPr>
-      <w:hyperlink w:anchor="_Toc243554908" w:history="1">
+      <w:hyperlink w:anchor="_Toc243555501" w:history="1">
         <w:r>
           <w:rPr>
             <w:rStyle w:val="Hipervnculo"/>
@@ -4777,7 +4777,7 @@
             <w:noProof/>
             <w:webHidden/>
           </w:rPr>
-          <w:instrText xml:space="preserve"> PAGEREF _Toc243554908 \h </w:instrText>
+          <w:instrText xml:space="preserve"> PAGEREF _Toc243555501 \h </w:instrText>
         </w:r>
         <w:r>
           <w:rPr>
@@ -4818,7 +4818,7 @@
           <w:noProof/>
         </w:rPr>
       </w:pPr>
-      <w:hyperlink w:anchor="_Toc243554909" w:history="1">
+      <w:hyperlink w:anchor="_Toc243555502" w:history="1">
         <w:r>
           <w:rPr>
             <w:rStyle w:val="Hipervnculo"/>
@@ -4845,7 +4845,7 @@
             <w:noProof/>
             <w:webHidden/>
           </w:rPr>
-          <w:instrText xml:space="preserve"> PAGEREF _Toc243554909 \h </w:instrText>
+          <w:instrText xml:space="preserve"> PAGEREF _Toc243555502 \h </w:instrText>
         </w:r>
         <w:r>
           <w:rPr>
@@ -4886,7 +4886,7 @@
           <w:noProof/>
         </w:rPr>
       </w:pPr>
-      <w:hyperlink w:anchor="_Toc243554910" w:history="1">
+      <w:hyperlink w:anchor="_Toc243555503" w:history="1">
         <w:r>
           <w:rPr>
             <w:rStyle w:val="Hipervnculo"/>
@@ -4913,7 +4913,7 @@
             <w:noProof/>
             <w:webHidden/>
           </w:rPr>
-          <w:instrText xml:space="preserve"> PAGEREF _Toc243554910 \h </w:instrText>
+          <w:instrText xml:space="preserve"> PAGEREF _Toc243555503 \h </w:instrText>
         </w:r>
         <w:r>
           <w:rPr>
@@ -4954,7 +4954,7 @@
           <w:noProof/>
         </w:rPr>
       </w:pPr>
-      <w:hyperlink w:anchor="_Toc243554911" w:history="1">
+      <w:hyperlink w:anchor="_Toc243555504" w:history="1">
         <w:r>
           <w:rPr>
             <w:rStyle w:val="Hipervnculo"/>
@@ -4981,7 +4981,7 @@
             <w:noProof/>
             <w:webHidden/>
           </w:rPr>
-          <w:instrText xml:space="preserve"> PAGEREF _Toc243554911 \h </w:instrText>
+          <w:instrText xml:space="preserve"> PAGEREF _Toc243555504 \h </w:instrText>
         </w:r>
         <w:r>
           <w:rPr>
@@ -5022,7 +5022,7 @@
           <w:noProof/>
         </w:rPr>
       </w:pPr>
-      <w:hyperlink w:anchor="_Toc243554912" w:history="1">
+      <w:hyperlink w:anchor="_Toc243555505" w:history="1">
         <w:r>
           <w:rPr>
             <w:rStyle w:val="Hipervnculo"/>
@@ -5049,7 +5049,7 @@
             <w:noProof/>
             <w:webHidden/>
           </w:rPr>
-          <w:instrText xml:space="preserve"> PAGEREF _Toc243554912 \h </w:instrText>
+          <w:instrText xml:space="preserve"> PAGEREF _Toc243555505 \h </w:instrText>
         </w:r>
         <w:r>
           <w:rPr>
@@ -5090,7 +5090,7 @@
           <w:noProof/>
         </w:rPr>
       </w:pPr>
-      <w:hyperlink w:anchor="_Toc243554913" w:history="1">
+      <w:hyperlink w:anchor="_Toc243555506" w:history="1">
         <w:r>
           <w:rPr>
             <w:rStyle w:val="Hipervnculo"/>
@@ -5117,7 +5117,7 @@
             <w:noProof/>
             <w:webHidden/>
           </w:rPr>
-          <w:instrText xml:space="preserve"> PAGEREF _Toc243554913 \h </w:instrText>
+          <w:instrText xml:space="preserve"> PAGEREF _Toc243555506 \h </w:instrText>
         </w:r>
         <w:r>
           <w:rPr>
@@ -5158,7 +5158,7 @@
           <w:noProof/>
         </w:rPr>
       </w:pPr>
-      <w:hyperlink w:anchor="_Toc243554914" w:history="1">
+      <w:hyperlink w:anchor="_Toc243555507" w:history="1">
         <w:r>
           <w:rPr>
             <w:rStyle w:val="Hipervnculo"/>
@@ -5185,7 +5185,7 @@
             <w:noProof/>
             <w:webHidden/>
           </w:rPr>
-          <w:instrText xml:space="preserve"> PAGEREF _Toc243554914 \h </w:instrText>
+          <w:instrText xml:space="preserve"> PAGEREF _Toc243555507 \h </w:instrText>
         </w:r>
         <w:r>
           <w:rPr>
@@ -5226,7 +5226,7 @@
           <w:noProof/>
         </w:rPr>
       </w:pPr>
-      <w:hyperlink w:anchor="_Toc243554915" w:history="1">
+      <w:hyperlink w:anchor="_Toc243555508" w:history="1">
         <w:r>
           <w:rPr>
             <w:rStyle w:val="Hipervnculo"/>
@@ -5253,7 +5253,7 @@
             <w:noProof/>
             <w:webHidden/>
           </w:rPr>
-          <w:instrText xml:space="preserve"> PAGEREF _Toc243554915 \h </w:instrText>
+          <w:instrText xml:space="preserve"> PAGEREF _Toc243555508 \h </w:instrText>
         </w:r>
         <w:r>
           <w:rPr>
@@ -5294,7 +5294,7 @@
           <w:noProof/>
         </w:rPr>
       </w:pPr>
-      <w:hyperlink w:anchor="_Toc243554916" w:history="1">
+      <w:hyperlink w:anchor="_Toc243555509" w:history="1">
         <w:r>
           <w:rPr>
             <w:rStyle w:val="Hipervnculo"/>
@@ -5321,7 +5321,7 @@
             <w:noProof/>
             <w:webHidden/>
           </w:rPr>
-          <w:instrText xml:space="preserve"> PAGEREF _Toc243554916 \h </w:instrText>
+          <w:instrText xml:space="preserve"> PAGEREF _Toc243555509 \h </w:instrText>
         </w:r>
         <w:r>
           <w:rPr>
@@ -5362,7 +5362,7 @@
           <w:noProof/>
         </w:rPr>
       </w:pPr>
-      <w:hyperlink w:anchor="_Toc243554917" w:history="1">
+      <w:hyperlink w:anchor="_Toc243555510" w:history="1">
         <w:r>
           <w:rPr>
             <w:rStyle w:val="Hipervnculo"/>
@@ -5389,7 +5389,7 @@
             <w:noProof/>
             <w:webHidden/>
           </w:rPr>
-          <w:instrText xml:space="preserve"> PAGEREF _Toc243554917 \h </w:instrText>
+          <w:instrText xml:space="preserve"> PAGEREF _Toc243555510 \h </w:instrText>
         </w:r>
         <w:r>
           <w:rPr>
@@ -5430,7 +5430,7 @@
           <w:noProof/>
         </w:rPr>
       </w:pPr>
-      <w:hyperlink w:anchor="_Toc243554918" w:history="1">
+      <w:hyperlink w:anchor="_Toc243555511" w:history="1">
         <w:r>
           <w:rPr>
             <w:rStyle w:val="Hipervnculo"/>
@@ -5457,7 +5457,7 @@
             <w:noProof/>
             <w:webHidden/>
           </w:rPr>
-          <w:instrText xml:space="preserve"> PAGEREF _Toc243554918 \h </w:instrText>
+          <w:instrText xml:space="preserve"> PAGEREF _Toc243555511 \h </w:instrText>
         </w:r>
         <w:r>
           <w:rPr>
@@ -5498,7 +5498,7 @@
           <w:noProof/>
         </w:rPr>
       </w:pPr>
-      <w:hyperlink w:anchor="_Toc243554919" w:history="1">
+      <w:hyperlink w:anchor="_Toc243555512" w:history="1">
         <w:r>
           <w:rPr>
             <w:rStyle w:val="Hipervnculo"/>
@@ -5525,7 +5525,7 @@
             <w:noProof/>
             <w:webHidden/>
           </w:rPr>
-          <w:instrText xml:space="preserve"> PAGEREF _Toc243554919 \h </w:instrText>
+          <w:instrText xml:space="preserve"> PAGEREF _Toc243555512 \h </w:instrText>
         </w:r>
         <w:r>
           <w:rPr>
@@ -5566,7 +5566,7 @@
           <w:noProof/>
         </w:rPr>
       </w:pPr>
-      <w:hyperlink w:anchor="_Toc243554920" w:history="1">
+      <w:hyperlink w:anchor="_Toc243555513" w:history="1">
         <w:r>
           <w:rPr>
             <w:rStyle w:val="Hipervnculo"/>
@@ -5593,7 +5593,7 @@
             <w:noProof/>
             <w:webHidden/>
           </w:rPr>
-          <w:instrText xml:space="preserve"> PAGEREF _Toc243554920 \h </w:instrText>
+          <w:instrText xml:space="preserve"> PAGEREF _Toc243555513 \h </w:instrText>
         </w:r>
         <w:r>
           <w:rPr>
@@ -5638,7 +5638,7 @@
       <w:pPr>
         <w:pStyle w:val="Ttulo1"/>
       </w:pPr>
-      <w:bookmarkStart w:id="1" w:name="_Toc243554847"/>
+      <w:bookmarkStart w:id="1" w:name="_Toc243555440"/>
       <w:r>
         <w:rPr>
           <w:rFonts w:ascii="Calibri" w:hAnsi="Calibri"/>
@@ -5652,7 +5652,7 @@
       <w:pPr>
         <w:pStyle w:val="Ttulo2"/>
       </w:pPr>
-      <w:bookmarkStart w:id="2" w:name="_Toc243554848"/>
+      <w:bookmarkStart w:id="2" w:name="_Toc243555441"/>
       <w:r>
         <w:rPr>
           <w:rFonts w:ascii="Calibri" w:hAnsi="Calibri"/>
@@ -5682,7 +5682,7 @@
       <w:pPr>
         <w:pStyle w:val="Ttulo2"/>
       </w:pPr>
-      <w:bookmarkStart w:id="3" w:name="_Toc243554849"/>
+      <w:bookmarkStart w:id="3" w:name="_Toc243555442"/>
       <w:r>
         <w:rPr>
           <w:rFonts w:ascii="Calibri" w:hAnsi="Calibri"/>
@@ -5754,7 +5754,7 @@
       <w:pPr>
         <w:pStyle w:val="Ttulo2"/>
       </w:pPr>
-      <w:bookmarkStart w:id="4" w:name="_Toc243554850"/>
+      <w:bookmarkStart w:id="4" w:name="_Toc243555443"/>
       <w:r>
         <w:rPr>
           <w:rFonts w:ascii="Calibri" w:hAnsi="Calibri"/>
@@ -5778,7 +5778,7 @@
       <w:pPr>
         <w:pStyle w:val="Ttulo2"/>
       </w:pPr>
-      <w:bookmarkStart w:id="5" w:name="_Toc243554851"/>
+      <w:bookmarkStart w:id="5" w:name="_Toc243555444"/>
       <w:r>
         <w:rPr>
           <w:rFonts w:ascii="Calibri" w:hAnsi="Calibri"/>
@@ -6674,7 +6674,7 @@
       <w:pPr>
         <w:pStyle w:val="Ttulo2"/>
       </w:pPr>
-      <w:bookmarkStart w:id="6" w:name="_Toc243554852"/>
+      <w:bookmarkStart w:id="6" w:name="_Toc243555445"/>
       <w:r>
         <w:rPr>
           <w:rFonts w:ascii="Calibri" w:hAnsi="Calibri"/>
@@ -6695,7 +6695,7 @@
       <w:pPr>
         <w:pStyle w:val="Ttulo2"/>
       </w:pPr>
-      <w:bookmarkStart w:id="7" w:name="_Toc243554853"/>
+      <w:bookmarkStart w:id="7" w:name="_Toc243555446"/>
       <w:r>
         <w:rPr>
           <w:rFonts w:ascii="Calibri" w:hAnsi="Calibri"/>
@@ -6741,7 +6741,7 @@
       <w:pPr>
         <w:pStyle w:val="Ttulo1"/>
       </w:pPr>
-      <w:bookmarkStart w:id="8" w:name="_Toc243554854"/>
+      <w:bookmarkStart w:id="8" w:name="_Toc243555447"/>
       <w:r>
         <w:rPr>
           <w:rFonts w:ascii="Calibri" w:hAnsi="Calibri"/>
@@ -6754,7 +6754,7 @@
       <w:pPr>
         <w:pStyle w:val="Ttulo2"/>
       </w:pPr>
-      <w:bookmarkStart w:id="9" w:name="_Toc243554855"/>
+      <w:bookmarkStart w:id="9" w:name="_Toc243555448"/>
       <w:r>
         <w:rPr>
           <w:rFonts w:ascii="Calibri" w:hAnsi="Calibri"/>
@@ -6782,7 +6782,7 @@
       <w:pPr>
         <w:pStyle w:val="Ttulo2"/>
       </w:pPr>
-      <w:bookmarkStart w:id="10" w:name="_Toc243554856"/>
+      <w:bookmarkStart w:id="10" w:name="_Toc243555449"/>
       <w:r>
         <w:rPr>
           <w:rFonts w:ascii="Calibri" w:hAnsi="Calibri"/>
@@ -7100,7 +7100,7 @@
       <w:pPr>
         <w:pStyle w:val="Ttulo2"/>
       </w:pPr>
-      <w:bookmarkStart w:id="11" w:name="_Toc243554857"/>
+      <w:bookmarkStart w:id="11" w:name="_Toc243555450"/>
       <w:r>
         <w:rPr>
           <w:rFonts w:ascii="Calibri" w:hAnsi="Calibri"/>
@@ -7371,7 +7371,7 @@
       <w:pPr>
         <w:pStyle w:val="Ttulo2"/>
       </w:pPr>
-      <w:bookmarkStart w:id="12" w:name="_Toc243554858"/>
+      <w:bookmarkStart w:id="12" w:name="_Toc243555451"/>
       <w:r>
         <w:rPr>
           <w:rFonts w:ascii="Calibri" w:hAnsi="Calibri"/>
@@ -7643,7 +7643,7 @@
       <w:pPr>
         <w:pStyle w:val="Ttulo2"/>
       </w:pPr>
-      <w:bookmarkStart w:id="13" w:name="_Toc243554859"/>
+      <w:bookmarkStart w:id="13" w:name="_Toc243555452"/>
       <w:r>
         <w:rPr>
           <w:rFonts w:ascii="Calibri" w:hAnsi="Calibri"/>
@@ -7671,7 +7671,7 @@
       <w:pPr>
         <w:pStyle w:val="Ttulo1"/>
       </w:pPr>
-      <w:bookmarkStart w:id="14" w:name="_Toc243554860"/>
+      <w:bookmarkStart w:id="14" w:name="_Toc243555453"/>
       <w:r>
         <w:rPr>
           <w:rFonts w:ascii="Calibri" w:hAnsi="Calibri"/>
@@ -7684,7 +7684,7 @@
       <w:pPr>
         <w:pStyle w:val="Ttulo2"/>
       </w:pPr>
-      <w:bookmarkStart w:id="15" w:name="_Toc243554861"/>
+      <w:bookmarkStart w:id="15" w:name="_Toc243555454"/>
       <w:r>
         <w:rPr>
           <w:rFonts w:ascii="Calibri" w:hAnsi="Calibri"/>
@@ -8127,7 +8127,7 @@
       <w:pPr>
         <w:pStyle w:val="Ttulo2"/>
       </w:pPr>
-      <w:bookmarkStart w:id="16" w:name="_Toc243554862"/>
+      <w:bookmarkStart w:id="16" w:name="_Toc243555455"/>
       <w:r>
         <w:rPr>
           <w:rFonts w:ascii="Calibri" w:hAnsi="Calibri"/>
@@ -9872,7 +9872,7 @@
       <w:pPr>
         <w:pStyle w:val="Ttulo2"/>
       </w:pPr>
-      <w:bookmarkStart w:id="17" w:name="_Toc243554863"/>
+      <w:bookmarkStart w:id="17" w:name="_Toc243555456"/>
       <w:r>
         <w:rPr>
           <w:rFonts w:ascii="Calibri" w:hAnsi="Calibri"/>
@@ -10723,7 +10723,7 @@
       <w:pPr>
         <w:pStyle w:val="Ttulo2"/>
       </w:pPr>
-      <w:bookmarkStart w:id="18" w:name="_Toc243554864"/>
+      <w:bookmarkStart w:id="18" w:name="_Toc243555457"/>
       <w:r>
         <w:rPr>
           <w:rFonts w:ascii="Calibri" w:hAnsi="Calibri"/>
@@ -11645,7 +11645,7 @@
       <w:pPr>
         <w:pStyle w:val="Ttulo1"/>
       </w:pPr>
-      <w:bookmarkStart w:id="19" w:name="_Toc243554865"/>
+      <w:bookmarkStart w:id="19" w:name="_Toc243555458"/>
       <w:r>
         <w:rPr>
           <w:rFonts w:ascii="Calibri" w:hAnsi="Calibri"/>
@@ -14864,7 +14864,7 @@
       <w:pPr>
         <w:pStyle w:val="Ttulo1"/>
       </w:pPr>
-      <w:bookmarkStart w:id="20" w:name="_Toc243554866"/>
+      <w:bookmarkStart w:id="20" w:name="_Toc243555459"/>
       <w:r>
         <w:rPr>
           <w:rFonts w:ascii="Calibri" w:hAnsi="Calibri"/>
@@ -14877,7 +14877,7 @@
       <w:pPr>
         <w:pStyle w:val="Ttulo2"/>
       </w:pPr>
-      <w:bookmarkStart w:id="21" w:name="_Toc243554867"/>
+      <w:bookmarkStart w:id="21" w:name="_Toc243555460"/>
       <w:r>
         <w:rPr>
           <w:rFonts w:ascii="Calibri" w:hAnsi="Calibri"/>
@@ -16952,7 +16952,7 @@
       <w:pPr>
         <w:pStyle w:val="Ttulo2"/>
       </w:pPr>
-      <w:bookmarkStart w:id="22" w:name="_Toc243554868"/>
+      <w:bookmarkStart w:id="22" w:name="_Toc243555461"/>
       <w:r>
         <w:rPr>
           <w:rFonts w:ascii="Calibri" w:hAnsi="Calibri"/>
@@ -17589,7 +17589,7 @@
       <w:pPr>
         <w:pStyle w:val="Ttulo2"/>
       </w:pPr>
-      <w:bookmarkStart w:id="23" w:name="_Toc243554869"/>
+      <w:bookmarkStart w:id="23" w:name="_Toc243555462"/>
       <w:r>
         <w:rPr>
           <w:rFonts w:ascii="Calibri" w:hAnsi="Calibri"/>
@@ -17980,7 +17980,7 @@
       <w:pPr>
         <w:pStyle w:val="Ttulo2"/>
       </w:pPr>
-      <w:bookmarkStart w:id="24" w:name="_Toc243554870"/>
+      <w:bookmarkStart w:id="24" w:name="_Toc243555463"/>
       <w:r>
         <w:rPr>
           <w:rFonts w:ascii="Calibri" w:hAnsi="Calibri"/>
@@ -19325,7 +19325,7 @@
       <w:pPr>
         <w:pStyle w:val="Ttulo1"/>
       </w:pPr>
-      <w:bookmarkStart w:id="25" w:name="_Toc243554871"/>
+      <w:bookmarkStart w:id="25" w:name="_Toc243555464"/>
       <w:r>
         <w:rPr>
           <w:rFonts w:ascii="Calibri" w:hAnsi="Calibri"/>
@@ -19344,7 +19344,7 @@
       <w:pPr>
         <w:pStyle w:val="Ttulo2"/>
       </w:pPr>
-      <w:bookmarkStart w:id="26" w:name="_Toc243554872"/>
+      <w:bookmarkStart w:id="26" w:name="_Toc243555465"/>
       <w:r>
         <w:rPr>
           <w:rFonts w:ascii="Calibri" w:hAnsi="Calibri"/>
@@ -20030,7 +20030,7 @@
       <w:pPr>
         <w:pStyle w:val="Ttulo2"/>
       </w:pPr>
-      <w:bookmarkStart w:id="27" w:name="_Toc243554873"/>
+      <w:bookmarkStart w:id="27" w:name="_Toc243555466"/>
       <w:r>
         <w:rPr>
           <w:rFonts w:ascii="Calibri" w:hAnsi="Calibri"/>
@@ -20682,7 +20682,7 @@
       <w:pPr>
         <w:pStyle w:val="Ttulo2"/>
       </w:pPr>
-      <w:bookmarkStart w:id="28" w:name="_Toc243554874"/>
+      <w:bookmarkStart w:id="28" w:name="_Toc243555467"/>
       <w:r>
         <w:rPr>
           <w:rFonts w:ascii="Calibri" w:hAnsi="Calibri"/>
@@ -21074,7 +21074,7 @@
       <w:pPr>
         <w:pStyle w:val="Ttulo2"/>
       </w:pPr>
-      <w:bookmarkStart w:id="29" w:name="_Toc243554875"/>
+      <w:bookmarkStart w:id="29" w:name="_Toc243555468"/>
       <w:r>
         <w:rPr>
           <w:rFonts w:ascii="Calibri" w:hAnsi="Calibri"/>
@@ -21451,7 +21451,7 @@
       <w:pPr>
         <w:pStyle w:val="Ttulo2"/>
       </w:pPr>
-      <w:bookmarkStart w:id="30" w:name="_Toc243554876"/>
+      <w:bookmarkStart w:id="30" w:name="_Toc243555469"/>
       <w:r>
         <w:rPr>
           <w:rFonts w:ascii="Calibri" w:hAnsi="Calibri"/>
@@ -22166,7 +22166,7 @@
       <w:pPr>
         <w:pStyle w:val="Ttulo1"/>
       </w:pPr>
-      <w:bookmarkStart w:id="31" w:name="_Toc243554877"/>
+      <w:bookmarkStart w:id="31" w:name="_Toc243555470"/>
       <w:r>
         <w:rPr>
           <w:rFonts w:ascii="Calibri" w:hAnsi="Calibri"/>
@@ -23325,7 +23325,7 @@
       <w:pPr>
         <w:pStyle w:val="Ttulo2"/>
       </w:pPr>
-      <w:bookmarkStart w:id="32" w:name="_Toc243554878"/>
+      <w:bookmarkStart w:id="32" w:name="_Toc243555471"/>
       <w:r>
         <w:rPr>
           <w:rFonts w:ascii="Calibri" w:hAnsi="Calibri"/>
@@ -23756,7 +23756,7 @@
       <w:pPr>
         <w:pStyle w:val="Ttulo1"/>
       </w:pPr>
-      <w:bookmarkStart w:id="33" w:name="_Toc243554879"/>
+      <w:bookmarkStart w:id="33" w:name="_Toc243555472"/>
       <w:r>
         <w:rPr>
           <w:rFonts w:ascii="Calibri" w:hAnsi="Calibri"/>
@@ -23816,7 +23816,7 @@
       <w:pPr>
         <w:pStyle w:val="Ttulo2"/>
       </w:pPr>
-      <w:bookmarkStart w:id="34" w:name="_Toc243554880"/>
+      <w:bookmarkStart w:id="34" w:name="_Toc243555473"/>
       <w:r>
         <w:rPr>
           <w:rFonts w:ascii="Calibri" w:hAnsi="Calibri"/>
@@ -24233,7 +24233,7 @@
       <w:pPr>
         <w:pStyle w:val="Ttulo2"/>
       </w:pPr>
-      <w:bookmarkStart w:id="35" w:name="_Toc243554881"/>
+      <w:bookmarkStart w:id="35" w:name="_Toc243555474"/>
       <w:r>
         <w:rPr>
           <w:rFonts w:ascii="Calibri" w:hAnsi="Calibri"/>
@@ -25055,7 +25055,7 @@
       <w:pPr>
         <w:pStyle w:val="Ttulo2"/>
       </w:pPr>
-      <w:bookmarkStart w:id="36" w:name="_Toc243554882"/>
+      <w:bookmarkStart w:id="36" w:name="_Toc243555475"/>
       <w:r>
         <w:rPr>
           <w:rFonts w:ascii="Calibri" w:hAnsi="Calibri"/>
@@ -25765,7 +25765,7 @@
       <w:pPr>
         <w:pStyle w:val="Ttulo2"/>
       </w:pPr>
-      <w:bookmarkStart w:id="37" w:name="_Toc243554883"/>
+      <w:bookmarkStart w:id="37" w:name="_Toc243555476"/>
       <w:r>
         <w:rPr>
           <w:rFonts w:ascii="Calibri" w:hAnsi="Calibri"/>
@@ -26474,7 +26474,7 @@
       <w:pPr>
         <w:pStyle w:val="Ttulo2"/>
       </w:pPr>
-      <w:bookmarkStart w:id="38" w:name="_Toc243554884"/>
+      <w:bookmarkStart w:id="38" w:name="_Toc243555477"/>
       <w:r>
         <w:rPr>
           <w:rFonts w:ascii="Calibri" w:hAnsi="Calibri"/>
@@ -27019,7 +27019,7 @@
       <w:pPr>
         <w:pStyle w:val="Ttulo2"/>
       </w:pPr>
-      <w:bookmarkStart w:id="39" w:name="_Toc243554885"/>
+      <w:bookmarkStart w:id="39" w:name="_Toc243555478"/>
       <w:r>
         <w:rPr>
           <w:rFonts w:ascii="Calibri" w:hAnsi="Calibri"/>
@@ -27629,7 +27629,7 @@
       <w:pPr>
         <w:pStyle w:val="Ttulo2"/>
       </w:pPr>
-      <w:bookmarkStart w:id="40" w:name="_Toc243554886"/>
+      <w:bookmarkStart w:id="40" w:name="_Toc243555479"/>
       <w:r>
         <w:rPr>
           <w:rFonts w:ascii="Calibri" w:hAnsi="Calibri"/>
@@ -28042,7 +28042,7 @@
       <w:pPr>
         <w:pStyle w:val="Ttulo2"/>
       </w:pPr>
-      <w:bookmarkStart w:id="41" w:name="_Toc243554887"/>
+      <w:bookmarkStart w:id="41" w:name="_Toc243555480"/>
       <w:r>
         <w:rPr>
           <w:rFonts w:ascii="Calibri" w:hAnsi="Calibri"/>
@@ -28355,7 +28355,7 @@
       <w:pPr>
         <w:pStyle w:val="Ttulo2"/>
       </w:pPr>
-      <w:bookmarkStart w:id="42" w:name="_Toc243554888"/>
+      <w:bookmarkStart w:id="42" w:name="_Toc243555481"/>
       <w:r>
         <w:rPr>
           <w:rFonts w:ascii="Calibri" w:hAnsi="Calibri"/>
@@ -28727,7 +28727,7 @@
       <w:pPr>
         <w:pStyle w:val="Ttulo2"/>
       </w:pPr>
-      <w:bookmarkStart w:id="43" w:name="_Toc243554889"/>
+      <w:bookmarkStart w:id="43" w:name="_Toc243555482"/>
       <w:r>
         <w:rPr>
           <w:rFonts w:ascii="Calibri" w:hAnsi="Calibri"/>
@@ -29548,7 +29548,7 @@
       <w:pPr>
         <w:pStyle w:val="Ttulo2"/>
       </w:pPr>
-      <w:bookmarkStart w:id="44" w:name="_Toc243554890"/>
+      <w:bookmarkStart w:id="44" w:name="_Toc243555483"/>
       <w:r>
         <w:rPr>
           <w:rFonts w:ascii="Calibri" w:hAnsi="Calibri"/>
@@ -29921,7 +29921,7 @@
       <w:pPr>
         <w:pStyle w:val="Ttulo2"/>
       </w:pPr>
-      <w:bookmarkStart w:id="45" w:name="_Toc243554891"/>
+      <w:bookmarkStart w:id="45" w:name="_Toc243555484"/>
       <w:r>
         <w:rPr>
           <w:rFonts w:ascii="Calibri" w:hAnsi="Calibri"/>
@@ -30340,7 +30340,7 @@
       <w:pPr>
         <w:pStyle w:val="Ttulo2"/>
       </w:pPr>
-      <w:bookmarkStart w:id="46" w:name="_Toc243554892"/>
+      <w:bookmarkStart w:id="46" w:name="_Toc243555485"/>
       <w:r>
         <w:rPr>
           <w:rFonts w:ascii="Calibri" w:hAnsi="Calibri"/>
@@ -30877,7 +30877,7 @@
       <w:pPr>
         <w:pStyle w:val="Ttulo2"/>
       </w:pPr>
-      <w:bookmarkStart w:id="47" w:name="_Toc243554893"/>
+      <w:bookmarkStart w:id="47" w:name="_Toc243555486"/>
       <w:r>
         <w:rPr>
           <w:rFonts w:ascii="Calibri" w:hAnsi="Calibri"/>
@@ -31256,7 +31256,7 @@
       <w:pPr>
         <w:pStyle w:val="Ttulo2"/>
       </w:pPr>
-      <w:bookmarkStart w:id="48" w:name="_Toc243554894"/>
+      <w:bookmarkStart w:id="48" w:name="_Toc243555487"/>
       <w:r>
         <w:rPr>
           <w:rFonts w:ascii="Calibri" w:hAnsi="Calibri"/>
@@ -31628,7 +31628,7 @@
       <w:pPr>
         <w:pStyle w:val="Ttulo2"/>
       </w:pPr>
-      <w:bookmarkStart w:id="49" w:name="_Toc243554895"/>
+      <w:bookmarkStart w:id="49" w:name="_Toc243555488"/>
       <w:r>
         <w:rPr>
           <w:rFonts w:ascii="Calibri" w:hAnsi="Calibri"/>
@@ -31941,7 +31941,7 @@
       <w:pPr>
         <w:pStyle w:val="Ttulo2"/>
       </w:pPr>
-      <w:bookmarkStart w:id="50" w:name="_Toc243554896"/>
+      <w:bookmarkStart w:id="50" w:name="_Toc243555489"/>
       <w:r>
         <w:rPr>
           <w:rFonts w:ascii="Calibri" w:hAnsi="Calibri"/>
@@ -34452,7 +34452,7 @@
       <w:pPr>
         <w:pStyle w:val="Ttulo2"/>
       </w:pPr>
-      <w:bookmarkStart w:id="51" w:name="_Toc243554897"/>
+      <w:bookmarkStart w:id="51" w:name="_Toc243555490"/>
       <w:r>
         <w:rPr>
           <w:rFonts w:ascii="Calibri" w:hAnsi="Calibri"/>
@@ -35762,7 +35762,7 @@
       <w:pPr>
         <w:pStyle w:val="Ttulo2"/>
       </w:pPr>
-      <w:bookmarkStart w:id="52" w:name="_Toc243554898"/>
+      <w:bookmarkStart w:id="52" w:name="_Toc243555491"/>
       <w:r>
         <w:rPr>
           <w:rFonts w:ascii="Calibri" w:hAnsi="Calibri"/>
@@ -36240,7 +36240,7 @@
       <w:pPr>
         <w:pStyle w:val="Ttulo2"/>
       </w:pPr>
-      <w:bookmarkStart w:id="53" w:name="_Toc243554899"/>
+      <w:bookmarkStart w:id="53" w:name="_Toc243555492"/>
       <w:r>
         <w:rPr>
           <w:rFonts w:ascii="Calibri" w:hAnsi="Calibri"/>
@@ -36633,7 +36633,7 @@
       <w:pPr>
         <w:pStyle w:val="Ttulo2"/>
       </w:pPr>
-      <w:bookmarkStart w:id="54" w:name="_Toc243554900"/>
+      <w:bookmarkStart w:id="54" w:name="_Toc243555493"/>
       <w:r>
         <w:rPr>
           <w:rFonts w:ascii="Calibri" w:hAnsi="Calibri"/>
@@ -36936,7 +36936,7 @@
       <w:pPr>
         <w:pStyle w:val="Ttulo1"/>
       </w:pPr>
-      <w:bookmarkStart w:id="55" w:name="_Toc243554901"/>
+      <w:bookmarkStart w:id="55" w:name="_Toc243555494"/>
       <w:r>
         <w:rPr>
           <w:rFonts w:ascii="Calibri" w:hAnsi="Calibri"/>
@@ -36949,7 +36949,7 @@
       <w:pPr>
         <w:pStyle w:val="Ttulo2"/>
       </w:pPr>
-      <w:bookmarkStart w:id="56" w:name="_Toc243554902"/>
+      <w:bookmarkStart w:id="56" w:name="_Toc243555495"/>
       <w:r>
         <w:rPr>
           <w:rFonts w:ascii="Calibri" w:hAnsi="Calibri"/>
@@ -36987,7 +36987,7 @@
       <w:pPr>
         <w:pStyle w:val="Ttulo2"/>
       </w:pPr>
-      <w:bookmarkStart w:id="57" w:name="_Toc243554903"/>
+      <w:bookmarkStart w:id="57" w:name="_Toc243555496"/>
       <w:r>
         <w:rPr>
           <w:rFonts w:ascii="Calibri" w:hAnsi="Calibri"/>
@@ -37084,7 +37084,7 @@
               <w:rPr>
                 <w:sz w:val="19"/>
               </w:rPr>
-              <w:t>22/10/2026 09:20:56</w:t>
+              <w:t>22/10/2026 09:49:39</w:t>
             </w:r>
           </w:p>
         </w:tc>
@@ -37356,7 +37356,7 @@
               <w:rPr>
                 <w:sz w:val="19"/>
               </w:rPr>
-              <w:t>99/99 APROBADOS en 66,9 s</w:t>
+              <w:t>99/99 APROBADOS en 66,2 s</w:t>
             </w:r>
           </w:p>
         </w:tc>
@@ -37366,7 +37366,7 @@
       <w:pPr>
         <w:pStyle w:val="Ttulo2"/>
       </w:pPr>
-      <w:bookmarkStart w:id="58" w:name="_Toc243554904"/>
+      <w:bookmarkStart w:id="58" w:name="_Toc243555497"/>
       <w:r>
         <w:rPr>
           <w:rFonts w:ascii="Calibri" w:hAnsi="Calibri"/>
@@ -37578,7 +37578,7 @@
               <w:rPr>
                 <w:sz w:val="19"/>
               </w:rPr>
-              <w:t>66,9 segundos</w:t>
+              <w:t>66,2 segundos</w:t>
             </w:r>
           </w:p>
         </w:tc>
@@ -37714,7 +37714,7 @@
       <w:pPr>
         <w:pStyle w:val="Ttulo2"/>
       </w:pPr>
-      <w:bookmarkStart w:id="59" w:name="_Toc243554905"/>
+      <w:bookmarkStart w:id="59" w:name="_Toc243555498"/>
       <w:r>
         <w:rPr>
           <w:rFonts w:ascii="Calibri" w:hAnsi="Calibri"/>
@@ -37727,7 +37727,7 @@
       <w:pPr>
         <w:pStyle w:val="Ttulo3"/>
       </w:pPr>
-      <w:bookmarkStart w:id="60" w:name="_Toc243554906"/>
+      <w:bookmarkStart w:id="60" w:name="_Toc243555499"/>
       <w:r>
         <w:rPr>
           <w:rFonts w:ascii="Calibri" w:hAnsi="Calibri"/>
@@ -38744,7 +38744,7 @@
               <w:rPr>
                 <w:sz w:val="16"/>
               </w:rPr>
-              <w:t>usuario creado por el administrador (id=7)</w:t>
+              <w:t>usuario creado por el administrador (id=16)</w:t>
             </w:r>
           </w:p>
         </w:tc>
@@ -39399,7 +39399,7 @@
               <w:rPr>
                 <w:sz w:val="16"/>
               </w:rPr>
-              <w:t>la idea se registro con docente_id=7 (el director)</w:t>
+              <w:t>la idea se registro con docente_id=16 (el director)</w:t>
             </w:r>
           </w:p>
         </w:tc>
@@ -39452,13 +39452,13 @@
               <w:rPr>
                 <w:sz w:val="16"/>
               </w:rPr>
-              <w:t xml:space="preserve">Ideas: la </w:t>
+              <w:t>Ideas: la</w:t>
             </w:r>
             <w:r>
               <w:rPr>
                 <w:sz w:val="16"/>
               </w:rPr>
-              <w:t>administracion publica indicando el docente</w:t>
+              <w:t xml:space="preserve"> administracion publica indicando el docente</w:t>
             </w:r>
           </w:p>
         </w:tc>
@@ -39474,7 +39474,7 @@
               <w:rPr>
                 <w:sz w:val="16"/>
               </w:rPr>
-              <w:t>la administracion publico la idea asignando al docente id=9</w:t>
+              <w:t>la administracion publico la idea asignando al docente id=18</w:t>
             </w:r>
           </w:p>
         </w:tc>
@@ -39618,7 +39618,7 @@
               <w:rPr>
                 <w:sz w:val="16"/>
               </w:rPr>
-              <w:t>la idea se edito y cambio de docente (id=9 -&gt; id=7)</w:t>
+              <w:t>la idea se edito y cambio de docente (id=18 -&gt; id=16)</w:t>
             </w:r>
           </w:p>
         </w:tc>
@@ -39687,13 +39687,13 @@
               <w:rPr>
                 <w:sz w:val="16"/>
               </w:rPr>
-              <w:t>la idea quedo en estado CERRADA y de</w:t>
+              <w:t xml:space="preserve">la idea quedo en estado CERRADA y </w:t>
             </w:r>
             <w:r>
               <w:rPr>
                 <w:sz w:val="16"/>
               </w:rPr>
-              <w:t>jo de ofrecerse a los estudiantes</w:t>
+              <w:t>dejo de ofrecerse a los estudiantes</w:t>
             </w:r>
           </w:p>
         </w:tc>
@@ -39900,7 +39900,7 @@
               <w:rPr>
                 <w:sz w:val="16"/>
               </w:rPr>
-              <w:t>anteproyecto id=2 en BORRADOR; la idea paso a SELECCIONADA</w:t>
+              <w:t>anteproyecto id=6 en BORRADOR; la idea paso a SELECCIONADA</w:t>
             </w:r>
           </w:p>
         </w:tc>
@@ -40119,7 +40119,7 @@
               <w:rPr>
                 <w:sz w:val="16"/>
               </w:rPr>
-              <w:t>anteproyecto paso a ENVIADO con director id=7 y enlace del documento</w:t>
+              <w:t>anteproyecto paso a ENVIADO con director id=16 y enlace del documento</w:t>
             </w:r>
           </w:p>
         </w:tc>
@@ -40551,7 +40551,7 @@
               <w:rPr>
                 <w:sz w:val="16"/>
               </w:rPr>
-              <w:t>anteproyecto id=3 enviado por el estudiante de prueba</w:t>
+              <w:t>anteproyecto id=7 enviado por el estudiante de prueba</w:t>
             </w:r>
           </w:p>
         </w:tc>
@@ -41073,7 +41073,7 @@
       <w:pPr>
         <w:pStyle w:val="Ttulo3"/>
       </w:pPr>
-      <w:bookmarkStart w:id="61" w:name="_Toc243554907"/>
+      <w:bookmarkStart w:id="61" w:name="_Toc243555500"/>
       <w:r>
         <w:rPr>
           <w:rFonts w:ascii="Calibri" w:hAnsi="Calibri"/>
@@ -41597,7 +41597,7 @@
               <w:rPr>
                 <w:sz w:val="16"/>
               </w:rPr>
-              <w:t>evaluador asignado (id=9) sobre un anteproyecto aprobado por el director</w:t>
+              <w:t>evaluador asignado (id=18) sobre un anteproyecto aprobado por el director</w:t>
             </w:r>
           </w:p>
         </w:tc>
@@ -41672,7 +41672,7 @@
               <w:rPr>
                 <w:sz w:val="16"/>
               </w:rPr>
-              <w:t>anteproyecto id=4 aprobado por el director</w:t>
+              <w:t>anteproyecto id=8 aprobado por el director</w:t>
             </w:r>
           </w:p>
         </w:tc>
@@ -41741,7 +41741,7 @@
               <w:rPr>
                 <w:sz w:val="16"/>
               </w:rPr>
-              <w:t>el director fue cambiado a id=8 sobre el anteproyecto ya aprobado</w:t>
+              <w:t>el director fue cambiado a id=17 sobre el anteproyecto ya aprobado</w:t>
             </w:r>
           </w:p>
         </w:tc>
@@ -42467,7 +42467,7 @@
               <w:rPr>
                 <w:sz w:val="16"/>
               </w:rPr>
-              <w:t>el informe muestra el anteproyecto E2E Anteproyecto 1792678789 con director, evaluador y notas</w:t>
+              <w:t>el informe muestra el anteproyecto E2E Anteproyecto 1792680513 con director, evaluador y notas</w:t>
             </w:r>
           </w:p>
         </w:tc>
@@ -42834,7 +42834,7 @@
               <w:rPr>
                 <w:sz w:val="16"/>
               </w:rPr>
-              <w:t xml:space="preserve">entrega=OBSERVADO, revisado_por=10, </w:t>
+              <w:t xml:space="preserve">entrega=OBSERVADO, revisado_por=19, </w:t>
             </w:r>
             <w:r>
               <w:rPr>
@@ -43724,7 +43724,7 @@
       <w:pPr>
         <w:pStyle w:val="Ttulo3"/>
       </w:pPr>
-      <w:bookmarkStart w:id="62" w:name="_Toc243554908"/>
+      <w:bookmarkStart w:id="62" w:name="_Toc243555501"/>
       <w:r>
         <w:rPr>
           <w:rFonts w:ascii="Calibri" w:hAnsi="Calibri"/>
@@ -43877,7 +43877,7 @@
               <w:rPr>
                 <w:sz w:val="16"/>
               </w:rPr>
-              <w:t>evento creado con id=4 (01/11/2026 al 05/11/2026, tipo Hito)</w:t>
+              <w:t>evento creado con id=5 (01/11/2026 al 05/11/2026, tipo Hito)</w:t>
             </w:r>
           </w:p>
         </w:tc>
@@ -43946,7 +43946,7 @@
               <w:rPr>
                 <w:sz w:val="16"/>
               </w:rPr>
-              <w:t>el evento quedo con titulo 'E2E evento editado 1792678789' y tipo ENTREGA</w:t>
+              <w:t>el evento quedo con titulo 'E2E evento editado 1792680513' y tipo ENTREGA</w:t>
             </w:r>
           </w:p>
         </w:tc>
@@ -44325,7 +44325,7 @@
               <w:rPr>
                 <w:sz w:val="16"/>
               </w:rPr>
-              <w:t>formato creado con id=3 y enlace externo</w:t>
+              <w:t>formato creado con id=5 y enlace externo</w:t>
             </w:r>
           </w:p>
         </w:tc>
@@ -44688,7 +44688,7 @@
               <w:rPr>
                 <w:sz w:val="16"/>
               </w:rPr>
-              <w:t>tramite id=1 en estado PENDIENTE y coordinacion notificada</w:t>
+              <w:t>tramite id=2 en estado PENDIENTE y coordinacion notificada</w:t>
             </w:r>
           </w:p>
         </w:tc>
@@ -44757,7 +44757,7 @@
               <w:rPr>
                 <w:sz w:val="16"/>
               </w:rPr>
-              <w:t>tramite APROBADO, resuelto por id=10 con respuesta registrada</w:t>
+              <w:t>tramite APROBADO, resuelto por id=19 con respuesta registrada</w:t>
             </w:r>
           </w:p>
         </w:tc>
@@ -45221,7 +45221,7 @@
       <w:pPr>
         <w:pStyle w:val="Ttulo2"/>
       </w:pPr>
-      <w:bookmarkStart w:id="63" w:name="_Toc243554909"/>
+      <w:bookmarkStart w:id="63" w:name="_Toc243555502"/>
       <w:r>
         <w:rPr>
           <w:rFonts w:ascii="Calibri" w:hAnsi="Calibri"/>
@@ -46549,7 +46549,7 @@
       <w:pPr>
         <w:pStyle w:val="Ttulo2"/>
       </w:pPr>
-      <w:bookmarkStart w:id="64" w:name="_Toc243554910"/>
+      <w:bookmarkStart w:id="64" w:name="_Toc243555503"/>
       <w:r>
         <w:rPr>
           <w:rFonts w:ascii="Calibri" w:hAnsi="Calibri"/>
@@ -46789,7 +46789,7 @@
       <w:pPr>
         <w:pStyle w:val="Ttulo2"/>
       </w:pPr>
-      <w:bookmarkStart w:id="65" w:name="_Toc243554911"/>
+      <w:bookmarkStart w:id="65" w:name="_Toc243555504"/>
       <w:r>
         <w:rPr>
           <w:rFonts w:ascii="Calibri" w:hAnsi="Calibri"/>
@@ -47686,7 +47686,7 @@
       <w:pPr>
         <w:pStyle w:val="Ttulo1"/>
       </w:pPr>
-      <w:bookmarkStart w:id="66" w:name="_Toc243554912"/>
+      <w:bookmarkStart w:id="66" w:name="_Toc243555505"/>
       <w:r>
         <w:rPr>
           <w:rFonts w:ascii="Calibri" w:hAnsi="Calibri"/>
@@ -47699,7 +47699,7 @@
       <w:pPr>
         <w:pStyle w:val="Ttulo2"/>
       </w:pPr>
-      <w:bookmarkStart w:id="67" w:name="_Toc243554913"/>
+      <w:bookmarkStart w:id="67" w:name="_Toc243555506"/>
       <w:r>
         <w:rPr>
           <w:rFonts w:ascii="Calibri" w:hAnsi="Calibri"/>
@@ -48065,7 +48065,7 @@
       <w:pPr>
         <w:pStyle w:val="Ttulo2"/>
       </w:pPr>
-      <w:bookmarkStart w:id="68" w:name="_Toc243554914"/>
+      <w:bookmarkStart w:id="68" w:name="_Toc243555507"/>
       <w:r>
         <w:rPr>
           <w:rFonts w:ascii="Calibri" w:hAnsi="Calibri"/>
@@ -48266,7 +48266,7 @@
       <w:pPr>
         <w:pStyle w:val="Ttulo2"/>
       </w:pPr>
-      <w:bookmarkStart w:id="69" w:name="_Toc243554915"/>
+      <w:bookmarkStart w:id="69" w:name="_Toc243555508"/>
       <w:r>
         <w:rPr>
           <w:rFonts w:ascii="Calibri" w:hAnsi="Calibri"/>
@@ -48516,7 +48516,7 @@
       <w:pPr>
         <w:pStyle w:val="Ttulo1"/>
       </w:pPr>
-      <w:bookmarkStart w:id="70" w:name="_Toc243554916"/>
+      <w:bookmarkStart w:id="70" w:name="_Toc243555509"/>
       <w:r>
         <w:rPr>
           <w:rFonts w:ascii="Calibri" w:hAnsi="Calibri"/>
@@ -48551,7 +48551,7 @@
       <w:pPr>
         <w:pStyle w:val="Ttulo1"/>
       </w:pPr>
-      <w:bookmarkStart w:id="71" w:name="_Toc243554917"/>
+      <w:bookmarkStart w:id="71" w:name="_Toc243555510"/>
       <w:r>
         <w:rPr>
           <w:rFonts w:ascii="Calibri" w:hAnsi="Calibri"/>
@@ -48659,7 +48659,7 @@
       <w:pPr>
         <w:pStyle w:val="Ttulo1"/>
       </w:pPr>
-      <w:bookmarkStart w:id="72" w:name="_Toc243554918"/>
+      <w:bookmarkStart w:id="72" w:name="_Toc243555511"/>
       <w:r>
         <w:rPr>
           <w:rFonts w:ascii="Calibri" w:hAnsi="Calibri"/>
@@ -49095,7 +49095,7 @@
       <w:pPr>
         <w:pStyle w:val="Ttulo1"/>
       </w:pPr>
-      <w:bookmarkStart w:id="73" w:name="_Toc243554919"/>
+      <w:bookmarkStart w:id="73" w:name="_Toc243555512"/>
       <w:r>
         <w:rPr>
           <w:rFonts w:ascii="Calibri" w:hAnsi="Calibri"/>
@@ -49159,7 +49159,7 @@
           <w:color w:val="1F1F1F"/>
           <w:sz w:val="16"/>
         </w:rPr>
-        <w:t>Ejecutado: 2026-10-22 09:20:56</w:t>
+        <w:t>Ejecutado: 2026-10-22 09:49:39</w:t>
       </w:r>
     </w:p>
     <w:p>
@@ -49201,7 +49201,7 @@
           <w:color w:val="1F1F1F"/>
           <w:sz w:val="16"/>
         </w:rPr>
-        <w:t>Resultado: 99/99 APROBADOS en 66.9 s</w:t>
+        <w:t>Resultado: 99/99 APROBADOS en 66.2 s</w:t>
       </w:r>
     </w:p>
     <w:p>
@@ -49343,7 +49343,7 @@
       <w:pPr>
         <w:pStyle w:val="Ttulo1"/>
       </w:pPr>
-      <w:bookmarkStart w:id="74" w:name="_Toc243554920"/>
+      <w:bookmarkStart w:id="74" w:name="_Toc243555513"/>
       <w:r>
         <w:rPr>
           <w:rFonts w:ascii="Calibri" w:hAnsi="Calibri"/>
@@ -61497,7 +61497,7 @@
     <w:autoRedefine/>
     <w:uiPriority w:val="39"/>
     <w:unhideWhenUsed/>
-    <w:rsid w:val="000539D7"/>
+    <w:rsid w:val="000C23F2"/>
     <w:pPr>
       <w:spacing w:after="100"/>
     </w:pPr>
@@ -61509,7 +61509,7 @@
     <w:autoRedefine/>
     <w:uiPriority w:val="39"/>
     <w:unhideWhenUsed/>
-    <w:rsid w:val="000539D7"/>
+    <w:rsid w:val="000C23F2"/>
     <w:pPr>
       <w:spacing w:after="100"/>
       <w:ind w:left="210"/>
@@ -61522,7 +61522,7 @@
     <w:autoRedefine/>
     <w:uiPriority w:val="39"/>
     <w:unhideWhenUsed/>
-    <w:rsid w:val="000539D7"/>
+    <w:rsid w:val="000C23F2"/>
     <w:pPr>
       <w:spacing w:after="100"/>
       <w:ind w:left="420"/>
@@ -61533,7 +61533,7 @@
     <w:basedOn w:val="Fuentedeprrafopredeter"/>
     <w:uiPriority w:val="99"/>
     <w:unhideWhenUsed/>
-    <w:rsid w:val="000539D7"/>
+    <w:rsid w:val="000C23F2"/>
     <w:rPr>
       <w:color w:val="0000FF" w:themeColor="hyperlink"/>
       <w:u w:val="single"/>

</xml_diff>

<commit_message>
Evaluador: boton Aplazar (corregir y reenviar) y boton Reprobar definitivo con estado REPROBADO terminal
</commit_message>
<xml_diff>
--- a/docs/Sistema_Trabajos_de_Grado_UTS.docx
+++ b/docs/Sistema_Trabajos_de_Grado_UTS.docx
@@ -14681,7 +14681,21 @@
           <w:color w:val="1F1F1F"/>
           <w:sz w:val="17"/>
         </w:rPr>
-        <w:t xml:space="preserve">    │   └── migracion_seguridad.sql  # Actualiza bases existentes (opcional)</w:t>
+        <w:t xml:space="preserve">    │   ├── migracion_seguridad.sql  # Actualiza bases existentes (opcional)</w:t>
+      </w:r>
+    </w:p>
+    <w:p>
+      <w:pPr>
+        <w:spacing w:after="0" w:before="0"/>
+        <w:ind w:left="283"/>
+      </w:pPr>
+      <w:r>
+        <w:rPr>
+          <w:rFonts w:ascii="Consolas" w:hAnsi="Consolas"/>
+          <w:color w:val="1F1F1F"/>
+          <w:sz w:val="17"/>
+        </w:rPr>
+        <w:t xml:space="preserve">    │   └── migracion_reprobacion.sql # Agrega el estado REPROBADO al ENUM (opcional)</w:t>
       </w:r>
     </w:p>
     <w:p>
@@ -18505,6 +18519,62 @@
                 <w:sz w:val="18"/>
               </w:rPr>
               <w:t>Amplía password, crea índices y UNIQUE y migra los hashes SHA-256 heredados.</w:t>
+            </w:r>
+          </w:p>
+        </w:tc>
+      </w:tr>
+      <w:tr>
+        <w:tc>
+          <w:tcPr>
+            <w:tcW w:type="dxa" w:w="3249"/>
+          </w:tcPr>
+          <w:p>
+            <w:pPr>
+              <w:spacing w:before="20" w:after="20"/>
+            </w:pPr>
+            <w:r/>
+            <w:r>
+              <w:rPr>
+                <w:b w:val="0"/>
+                <w:sz w:val="18"/>
+              </w:rPr>
+              <w:t>Agregar el estado REPROBADO</w:t>
+            </w:r>
+          </w:p>
+        </w:tc>
+        <w:tc>
+          <w:tcPr>
+            <w:tcW w:type="dxa" w:w="3249"/>
+          </w:tcPr>
+          <w:p>
+            <w:pPr>
+              <w:spacing w:before="20" w:after="20"/>
+            </w:pPr>
+            <w:r/>
+            <w:r>
+              <w:rPr>
+                <w:b w:val="0"/>
+                <w:sz w:val="18"/>
+              </w:rPr>
+              <w:t>cmd /c "mysql -uroot &lt; tguts\sql\migracion_reprobacion.sql"</w:t>
+            </w:r>
+          </w:p>
+        </w:tc>
+        <w:tc>
+          <w:tcPr>
+            <w:tcW w:type="dxa" w:w="3249"/>
+          </w:tcPr>
+          <w:p>
+            <w:pPr>
+              <w:spacing w:before="20" w:after="20"/>
+            </w:pPr>
+            <w:r/>
+            <w:r>
+              <w:rPr>
+                <w:b w:val="0"/>
+                <w:sz w:val="18"/>
+              </w:rPr>
+              <w:t>Agrega REPROBADO al ENUM de estado de anteproyectos (reprobación definitiva del evaluador).</w:t>
             </w:r>
           </w:p>
         </w:tc>

</xml_diff>